<commit_message>
BRD-02 Operations sign-off set v2.0 rebuilt on the final retake: Start Here, guide deck, FRS, sign-off workbook, test plan and summary; UX screen deck, UX screen register and image package; ACSL persona texts, the ACSL team leader's menu kept once; drop index
</commit_message>
<xml_diff>
--- a/docs/deliverables/out/Drop-1_Transactional/BRD-02_Operations/00_BIBS_StartHere_BRD-02_Operations_v2.0.docx
+++ b/docs/deliverables/out/Drop-1_Transactional/BRD-02_Operations/00_BIBS_StartHere_BRD-02_Operations_v2.0.docx
@@ -1727,7 +1727,7 @@
           <w:t xml:space="preserve">	</w:t>
         </w:r>
         <w:r>
-          <w:t xml:space="preserve">4</w:t>
+          <w:t xml:space="preserve">5</w:t>
         </w:r>
       </w:hyperlink>
     </w:p>
@@ -1753,13 +1753,29 @@
       </w:pPr>
       <w:hyperlink w:anchor="_Toc000105" w:history="1">
         <w:r>
-          <w:t xml:space="preserve">5 Change control after sign-off</w:t>
+          <w:t xml:space="preserve">5 Who signs what</w:t>
         </w:r>
         <w:r>
           <w:t xml:space="preserve">	</w:t>
         </w:r>
         <w:r>
           <w:t xml:space="preserve">6</w:t>
+        </w:r>
+      </w:hyperlink>
+    </w:p>
+    <w:p>
+      <w:pPr>
+        <w:pStyle w:val="toc1"/>
+      </w:pPr>
+      <w:hyperlink w:anchor="_Toc000106" w:history="1">
+        <w:r>
+          <w:t xml:space="preserve">6 Change control after sign-off</w:t>
+        </w:r>
+        <w:r>
+          <w:t xml:space="preserve">	</w:t>
+        </w:r>
+        <w:r>
+          <w:t xml:space="preserve">8</w:t>
         </w:r>
       </w:hyperlink>
       <w:r>
@@ -2508,6 +2524,280 @@
           </w:p>
         </w:tc>
       </w:tr>
+      <w:tr>
+        <w:tc>
+          <w:tcPr>
+            <w:tcW w:type="dxa" w:w="2946"/>
+            <w:tcMar>
+              <w:top w:w="50" w:type="dxa"/>
+              <w:bottom w:w="50" w:type="dxa"/>
+              <w:left w:w="90" w:type="dxa"/>
+              <w:right w:w="90" w:type="dxa"/>
+            </w:tcMar>
+          </w:tcPr>
+          <w:p>
+            <w:pPr>
+              <w:pStyle w:val="BDOITable"/>
+            </w:pPr>
+            <w:r>
+              <w:rPr>
+                <w:sz w:val="15"/>
+              </w:rPr>
+              <w:t>07_BIBS_UXDeck_BRD-02_Operations_v2.0.pptx</w:t>
+            </w:r>
+          </w:p>
+        </w:tc>
+        <w:tc>
+          <w:tcPr>
+            <w:tcW w:type="dxa" w:w="3626"/>
+            <w:tcMar>
+              <w:top w:w="50" w:type="dxa"/>
+              <w:bottom w:w="50" w:type="dxa"/>
+              <w:left w:w="90" w:type="dxa"/>
+              <w:right w:w="90" w:type="dxa"/>
+            </w:tcMar>
+          </w:tcPr>
+          <w:p>
+            <w:pPr>
+              <w:pStyle w:val="BDOITable"/>
+            </w:pPr>
+            <w:r>
+              <w:rPr>
+                <w:sz w:val="15"/>
+              </w:rPr>
+              <w:t>UX Screen Deck for the BDOI UX Design team: design foundation, navigation and personas, every walkthrough step by step and every screen with all its states</w:t>
+            </w:r>
+          </w:p>
+        </w:tc>
+        <w:tc>
+          <w:tcPr>
+            <w:tcW w:type="dxa" w:w="1926"/>
+            <w:tcMar>
+              <w:top w:w="50" w:type="dxa"/>
+              <w:bottom w:w="50" w:type="dxa"/>
+              <w:left w:w="90" w:type="dxa"/>
+              <w:right w:w="90" w:type="dxa"/>
+            </w:tcMar>
+          </w:tcPr>
+          <w:p>
+            <w:pPr>
+              <w:pStyle w:val="BDOITable"/>
+            </w:pPr>
+            <w:r>
+              <w:rPr>
+                <w:sz w:val="15"/>
+              </w:rPr>
+              <w:t>BDOI UX Design team</w:t>
+            </w:r>
+          </w:p>
+        </w:tc>
+        <w:tc>
+          <w:tcPr>
+            <w:tcW w:type="dxa" w:w="1473"/>
+            <w:tcMar>
+              <w:top w:w="50" w:type="dxa"/>
+              <w:bottom w:w="50" w:type="dxa"/>
+              <w:left w:w="90" w:type="dxa"/>
+              <w:right w:w="90" w:type="dxa"/>
+            </w:tcMar>
+          </w:tcPr>
+          <w:p>
+            <w:pPr>
+              <w:pStyle w:val="BDOITable"/>
+            </w:pPr>
+            <w:r>
+              <w:rPr>
+                <w:sz w:val="15"/>
+              </w:rPr>
+              <w:t>From the issue, in parallel with the review; re-issued with each version of the set</w:t>
+            </w:r>
+          </w:p>
+        </w:tc>
+      </w:tr>
+      <w:tr>
+        <w:tc>
+          <w:tcPr>
+            <w:tcW w:type="dxa" w:w="2946"/>
+            <w:tcMar>
+              <w:top w:w="50" w:type="dxa"/>
+              <w:bottom w:w="50" w:type="dxa"/>
+              <w:left w:w="90" w:type="dxa"/>
+              <w:right w:w="90" w:type="dxa"/>
+            </w:tcMar>
+            <w:shd w:val="clear" w:color="auto" w:fill="E5F5FF"/>
+          </w:tcPr>
+          <w:p>
+            <w:pPr>
+              <w:pStyle w:val="BDOITable"/>
+            </w:pPr>
+            <w:r>
+              <w:rPr>
+                <w:sz w:val="15"/>
+              </w:rPr>
+              <w:t>08_BIBS_UXScreens_BRD-02_Operations_v2.0.xlsx</w:t>
+            </w:r>
+          </w:p>
+        </w:tc>
+        <w:tc>
+          <w:tcPr>
+            <w:tcW w:type="dxa" w:w="3626"/>
+            <w:tcMar>
+              <w:top w:w="50" w:type="dxa"/>
+              <w:bottom w:w="50" w:type="dxa"/>
+              <w:left w:w="90" w:type="dxa"/>
+              <w:right w:w="90" w:type="dxa"/>
+            </w:tcMar>
+            <w:shd w:val="clear" w:color="auto" w:fill="E5F5FF"/>
+          </w:tcPr>
+          <w:p>
+            <w:pPr>
+              <w:pStyle w:val="BDOITable"/>
+            </w:pPr>
+            <w:r>
+              <w:rPr>
+                <w:sz w:val="15"/>
+              </w:rPr>
+              <w:t>UX screen register: one row per screen image with the screen, personas, walkthrough and step, state, FRS section and requirements, UXD status and comments, and the Changed in this issue flag</w:t>
+            </w:r>
+          </w:p>
+        </w:tc>
+        <w:tc>
+          <w:tcPr>
+            <w:tcW w:type="dxa" w:w="1926"/>
+            <w:tcMar>
+              <w:top w:w="50" w:type="dxa"/>
+              <w:bottom w:w="50" w:type="dxa"/>
+              <w:left w:w="90" w:type="dxa"/>
+              <w:right w:w="90" w:type="dxa"/>
+            </w:tcMar>
+            <w:shd w:val="clear" w:color="auto" w:fill="E5F5FF"/>
+          </w:tcPr>
+          <w:p>
+            <w:pPr>
+              <w:pStyle w:val="BDOITable"/>
+            </w:pPr>
+            <w:r>
+              <w:rPr>
+                <w:sz w:val="15"/>
+              </w:rPr>
+              <w:t>BDOI UX Design team</w:t>
+            </w:r>
+          </w:p>
+        </w:tc>
+        <w:tc>
+          <w:tcPr>
+            <w:tcW w:type="dxa" w:w="1473"/>
+            <w:tcMar>
+              <w:top w:w="50" w:type="dxa"/>
+              <w:bottom w:w="50" w:type="dxa"/>
+              <w:left w:w="90" w:type="dxa"/>
+              <w:right w:w="90" w:type="dxa"/>
+            </w:tcMar>
+            <w:shd w:val="clear" w:color="auto" w:fill="E5F5FF"/>
+          </w:tcPr>
+          <w:p>
+            <w:pPr>
+              <w:pStyle w:val="BDOITable"/>
+            </w:pPr>
+            <w:r>
+              <w:rPr>
+                <w:sz w:val="15"/>
+              </w:rPr>
+              <w:t>Kept by the UX Design team; the changed rows are flagged at each issue</w:t>
+            </w:r>
+          </w:p>
+        </w:tc>
+      </w:tr>
+      <w:tr>
+        <w:tc>
+          <w:tcPr>
+            <w:tcW w:type="dxa" w:w="2946"/>
+            <w:tcMar>
+              <w:top w:w="50" w:type="dxa"/>
+              <w:bottom w:w="50" w:type="dxa"/>
+              <w:left w:w="90" w:type="dxa"/>
+              <w:right w:w="90" w:type="dxa"/>
+            </w:tcMar>
+          </w:tcPr>
+          <w:p>
+            <w:pPr>
+              <w:pStyle w:val="BDOITable"/>
+            </w:pPr>
+            <w:r>
+              <w:rPr>
+                <w:sz w:val="15"/>
+              </w:rPr>
+              <w:t>09_BIBS_UXScreens_BRD-02_Operations_v2.0.zip</w:t>
+            </w:r>
+          </w:p>
+        </w:tc>
+        <w:tc>
+          <w:tcPr>
+            <w:tcW w:type="dxa" w:w="3626"/>
+            <w:tcMar>
+              <w:top w:w="50" w:type="dxa"/>
+              <w:bottom w:w="50" w:type="dxa"/>
+              <w:left w:w="90" w:type="dxa"/>
+              <w:right w:w="90" w:type="dxa"/>
+            </w:tcMar>
+          </w:tcPr>
+          <w:p>
+            <w:pPr>
+              <w:pStyle w:val="BDOITable"/>
+            </w:pPr>
+            <w:r>
+              <w:rPr>
+                <w:sz w:val="15"/>
+              </w:rPr>
+              <w:t>Image package: every screen image at twice the screen resolution (PNG), the component crops and the register as CSV</w:t>
+            </w:r>
+          </w:p>
+        </w:tc>
+        <w:tc>
+          <w:tcPr>
+            <w:tcW w:type="dxa" w:w="1926"/>
+            <w:tcMar>
+              <w:top w:w="50" w:type="dxa"/>
+              <w:bottom w:w="50" w:type="dxa"/>
+              <w:left w:w="90" w:type="dxa"/>
+              <w:right w:w="90" w:type="dxa"/>
+            </w:tcMar>
+          </w:tcPr>
+          <w:p>
+            <w:pPr>
+              <w:pStyle w:val="BDOITable"/>
+            </w:pPr>
+            <w:r>
+              <w:rPr>
+                <w:sz w:val="15"/>
+              </w:rPr>
+              <w:t>BDOI UX Design team</w:t>
+            </w:r>
+          </w:p>
+        </w:tc>
+        <w:tc>
+          <w:tcPr>
+            <w:tcW w:type="dxa" w:w="1473"/>
+            <w:tcMar>
+              <w:top w:w="50" w:type="dxa"/>
+              <w:bottom w:w="50" w:type="dxa"/>
+              <w:left w:w="90" w:type="dxa"/>
+              <w:right w:w="90" w:type="dxa"/>
+            </w:tcMar>
+          </w:tcPr>
+          <w:p>
+            <w:pPr>
+              <w:pStyle w:val="BDOITable"/>
+            </w:pPr>
+            <w:r>
+              <w:rPr>
+                <w:sz w:val="15"/>
+              </w:rPr>
+              <w:t>Imported into the design tool at each issue</w:t>
+            </w:r>
+          </w:p>
+        </w:tc>
+      </w:tr>
     </w:tbl>
     <w:p>
       <w:pPr>
@@ -3027,6 +3317,54 @@
                 <w:b/>
                 <w:sz w:val="16"/>
               </w:rPr>
+              <w:t>BDOI UX Design team</w:t>
+            </w:r>
+          </w:p>
+        </w:tc>
+        <w:tc>
+          <w:tcPr>
+            <w:tcW w:type="dxa" w:w="7592"/>
+            <w:tcMar>
+              <w:top w:w="50" w:type="dxa"/>
+              <w:bottom w:w="50" w:type="dxa"/>
+              <w:left w:w="90" w:type="dxa"/>
+              <w:right w:w="90" w:type="dxa"/>
+            </w:tcMar>
+          </w:tcPr>
+          <w:p>
+            <w:pPr>
+              <w:pStyle w:val="BDOITable"/>
+            </w:pPr>
+            <w:r>
+              <w:rPr>
+                <w:sz w:val="16"/>
+              </w:rPr>
+              <w:t>07 UX Screen Deck: design foundation and navigation first, then the personas, walkthroughs and screens of the design work; 08 UX screen register (filter Changed in this issue at each new issue); 09 image package in the design tool</w:t>
+            </w:r>
+          </w:p>
+        </w:tc>
+      </w:tr>
+      <w:tr>
+        <w:tc>
+          <w:tcPr>
+            <w:tcW w:type="dxa" w:w="2380"/>
+            <w:tcMar>
+              <w:top w:w="50" w:type="dxa"/>
+              <w:bottom w:w="50" w:type="dxa"/>
+              <w:left w:w="90" w:type="dxa"/>
+              <w:right w:w="90" w:type="dxa"/>
+            </w:tcMar>
+            <w:shd w:val="clear" w:color="auto" w:fill="E5F5FF"/>
+          </w:tcPr>
+          <w:p>
+            <w:pPr>
+              <w:pStyle w:val="BDOITable"/>
+            </w:pPr>
+            <w:r>
+              <w:rPr>
+                <w:b/>
+                <w:sz w:val="16"/>
+              </w:rPr>
               <w:t>iorta TechNXT project team</w:t>
             </w:r>
           </w:p>
@@ -3040,6 +3378,7 @@
               <w:left w:w="90" w:type="dxa"/>
               <w:right w:w="90" w:type="dxa"/>
             </w:tcMar>
+            <w:shd w:val="clear" w:color="auto" w:fill="E5F5FF"/>
           </w:tcPr>
           <w:p>
             <w:pPr>
@@ -4828,9 +5167,2169 @@
       <w:bookmarkStart w:id="105" w:name="_Toc000105"/>
       <w:r>
         <w:rPr/>
-        <w:t>5 Change control after sign-off</w:t>
+        <w:t>5 Who signs what</w:t>
       </w:r>
       <w:bookmarkEnd w:id="105"/>
+    </w:p>
+    <w:p>
+      <w:r>
+        <w:rPr/>
+        <w:t>The set holds business content only: the screens and fields, the columns of the lists, reports and templates that the user sees or fills in, the validations, business rules, messages, notifications, documents, walkthroughs and reports. The business users sign that content. Technical content (the interfaces between systems, data storage, security set-up) is not part of the set: it is in the Technical Specification, a separate document reviewed by BDOI IT. The roles are those of the approval sheet of the Operations BRD: iorta TechNXT and the Business Analyst of Business Project Services prepare the set, Operations: Financial Transactions and Processing provides the input, BDOI IT reviews the interfaces, the user access and the Technical Specification, and the Program Manager of Business Project Services, Operations: Financial Transactions and Processing and the Product Owner approve it.</w:t>
+      </w:r>
+    </w:p>
+    <w:p>
+      <w:pPr>
+        <w:pStyle w:val="Caption"/>
+        <w:keepNext/>
+        <w:spacing w:after="60"/>
+      </w:pPr>
+      <w:r>
+        <w:rPr>
+          <w:b/>
+          <w:i w:val="0"/>
+        </w:rPr>
+        <w:t xml:space="preserve">Table 5: </w:t>
+      </w:r>
+      <w:r>
+        <w:rPr/>
+        <w:t>Who signs what: responsibility per part of the set</w:t>
+      </w:r>
+    </w:p>
+    <w:tbl>
+      <w:tblPr>
+        <w:tblW w:type="dxa" w:w="9973"/>
+        <w:jc w:val="center"/>
+        <w:tblLook w:firstColumn="1" w:firstRow="1" w:lastColumn="0" w:lastRow="0" w:noHBand="0" w:noVBand="1" w:val="04A0"/>
+        <w:tblBorders>
+          <w:top w:val="single" w:sz="4" w:space="0" w:color="C2C2C1"/>
+          <w:left w:val="single" w:sz="4" w:space="0" w:color="C2C2C1"/>
+          <w:bottom w:val="single" w:sz="4" w:space="0" w:color="C2C2C1"/>
+          <w:right w:val="single" w:sz="4" w:space="0" w:color="C2C2C1"/>
+          <w:insideH w:val="single" w:sz="4" w:space="0" w:color="C2C2C1"/>
+          <w:insideV w:val="single" w:sz="4" w:space="0" w:color="C2C2C1"/>
+        </w:tblBorders>
+        <w:tblLayout w:type="fixed"/>
+      </w:tblPr>
+      <w:tblGrid>
+        <w:gridCol w:w="2946"/>
+        <w:gridCol w:w="1359"/>
+        <w:gridCol w:w="1813"/>
+        <w:gridCol w:w="1699"/>
+        <w:gridCol w:w="2153"/>
+      </w:tblGrid>
+      <w:tr>
+        <w:trPr>
+          <w:tblHeader w:val="true"/>
+          <w:cantSplit w:val="true"/>
+        </w:trPr>
+        <w:tc>
+          <w:tcPr>
+            <w:tcW w:type="dxa" w:w="2946"/>
+            <w:shd w:val="clear" w:color="auto" w:fill="004EA8"/>
+            <w:tcMar>
+              <w:top w:w="50" w:type="dxa"/>
+              <w:bottom w:w="50" w:type="dxa"/>
+              <w:left w:w="90" w:type="dxa"/>
+              <w:right w:w="90" w:type="dxa"/>
+            </w:tcMar>
+            <w:vAlign w:val="center"/>
+          </w:tcPr>
+          <w:p>
+            <w:pPr>
+              <w:pStyle w:val="BDOITableHeader"/>
+            </w:pPr>
+            <w:r>
+              <w:rPr>
+                <w:b/>
+                <w:color w:val="FFFFFF"/>
+                <w:sz w:val="15"/>
+              </w:rPr>
+              <w:t>Part of the set</w:t>
+            </w:r>
+          </w:p>
+        </w:tc>
+        <w:tc>
+          <w:tcPr>
+            <w:tcW w:type="dxa" w:w="1360"/>
+            <w:shd w:val="clear" w:color="auto" w:fill="004EA8"/>
+            <w:tcMar>
+              <w:top w:w="50" w:type="dxa"/>
+              <w:bottom w:w="50" w:type="dxa"/>
+              <w:left w:w="90" w:type="dxa"/>
+              <w:right w:w="90" w:type="dxa"/>
+            </w:tcMar>
+            <w:vAlign w:val="center"/>
+          </w:tcPr>
+          <w:p>
+            <w:pPr>
+              <w:pStyle w:val="BDOITableHeader"/>
+            </w:pPr>
+            <w:r>
+              <w:rPr>
+                <w:b/>
+                <w:color w:val="FFFFFF"/>
+                <w:sz w:val="15"/>
+              </w:rPr>
+              <w:t>Prepares</w:t>
+            </w:r>
+          </w:p>
+        </w:tc>
+        <w:tc>
+          <w:tcPr>
+            <w:tcW w:type="dxa" w:w="1813"/>
+            <w:shd w:val="clear" w:color="auto" w:fill="004EA8"/>
+            <w:tcMar>
+              <w:top w:w="50" w:type="dxa"/>
+              <w:bottom w:w="50" w:type="dxa"/>
+              <w:left w:w="90" w:type="dxa"/>
+              <w:right w:w="90" w:type="dxa"/>
+            </w:tcMar>
+            <w:vAlign w:val="center"/>
+          </w:tcPr>
+          <w:p>
+            <w:pPr>
+              <w:pStyle w:val="BDOITableHeader"/>
+            </w:pPr>
+            <w:r>
+              <w:rPr>
+                <w:b/>
+                <w:color w:val="FFFFFF"/>
+                <w:sz w:val="15"/>
+              </w:rPr>
+              <w:t>Provides input</w:t>
+            </w:r>
+          </w:p>
+        </w:tc>
+        <w:tc>
+          <w:tcPr>
+            <w:tcW w:type="dxa" w:w="1700"/>
+            <w:shd w:val="clear" w:color="auto" w:fill="004EA8"/>
+            <w:tcMar>
+              <w:top w:w="50" w:type="dxa"/>
+              <w:bottom w:w="50" w:type="dxa"/>
+              <w:left w:w="90" w:type="dxa"/>
+              <w:right w:w="90" w:type="dxa"/>
+            </w:tcMar>
+            <w:vAlign w:val="center"/>
+          </w:tcPr>
+          <w:p>
+            <w:pPr>
+              <w:pStyle w:val="BDOITableHeader"/>
+            </w:pPr>
+            <w:r>
+              <w:rPr>
+                <w:b/>
+                <w:color w:val="FFFFFF"/>
+                <w:sz w:val="15"/>
+              </w:rPr>
+              <w:t>Reviews</w:t>
+            </w:r>
+          </w:p>
+        </w:tc>
+        <w:tc>
+          <w:tcPr>
+            <w:tcW w:type="dxa" w:w="2153"/>
+            <w:shd w:val="clear" w:color="auto" w:fill="004EA8"/>
+            <w:tcMar>
+              <w:top w:w="50" w:type="dxa"/>
+              <w:bottom w:w="50" w:type="dxa"/>
+              <w:left w:w="90" w:type="dxa"/>
+              <w:right w:w="90" w:type="dxa"/>
+            </w:tcMar>
+            <w:vAlign w:val="center"/>
+          </w:tcPr>
+          <w:p>
+            <w:pPr>
+              <w:pStyle w:val="BDOITableHeader"/>
+            </w:pPr>
+            <w:r>
+              <w:rPr>
+                <w:b/>
+                <w:color w:val="FFFFFF"/>
+                <w:sz w:val="15"/>
+              </w:rPr>
+              <w:t>Approves</w:t>
+            </w:r>
+          </w:p>
+        </w:tc>
+      </w:tr>
+      <w:tr>
+        <w:tc>
+          <w:tcPr>
+            <w:tcW w:type="dxa" w:w="2946"/>
+            <w:tcMar>
+              <w:top w:w="50" w:type="dxa"/>
+              <w:bottom w:w="50" w:type="dxa"/>
+              <w:left w:w="90" w:type="dxa"/>
+              <w:right w:w="90" w:type="dxa"/>
+            </w:tcMar>
+          </w:tcPr>
+          <w:p>
+            <w:pPr>
+              <w:pStyle w:val="BDOITable"/>
+            </w:pPr>
+            <w:r>
+              <w:rPr>
+                <w:b/>
+                <w:sz w:val="15"/>
+              </w:rPr>
+              <w:t>Screens and fields (FRS screen specifications; workbook Screen catalogue, Field register)</w:t>
+            </w:r>
+          </w:p>
+        </w:tc>
+        <w:tc>
+          <w:tcPr>
+            <w:tcW w:type="dxa" w:w="1360"/>
+            <w:tcMar>
+              <w:top w:w="50" w:type="dxa"/>
+              <w:bottom w:w="50" w:type="dxa"/>
+              <w:left w:w="90" w:type="dxa"/>
+              <w:right w:w="90" w:type="dxa"/>
+            </w:tcMar>
+          </w:tcPr>
+          <w:p>
+            <w:pPr>
+              <w:pStyle w:val="BDOITable"/>
+            </w:pPr>
+            <w:r>
+              <w:rPr>
+                <w:sz w:val="15"/>
+              </w:rPr>
+              <w:t>iorta TechNXT</w:t>
+            </w:r>
+          </w:p>
+        </w:tc>
+        <w:tc>
+          <w:tcPr>
+            <w:tcW w:type="dxa" w:w="1813"/>
+            <w:tcMar>
+              <w:top w:w="50" w:type="dxa"/>
+              <w:bottom w:w="50" w:type="dxa"/>
+              <w:left w:w="90" w:type="dxa"/>
+              <w:right w:w="90" w:type="dxa"/>
+            </w:tcMar>
+          </w:tcPr>
+          <w:p>
+            <w:pPr>
+              <w:pStyle w:val="BDOITable"/>
+            </w:pPr>
+            <w:r>
+              <w:rPr>
+                <w:sz w:val="15"/>
+              </w:rPr>
+              <w:t>FT&amp;P input</w:t>
+            </w:r>
+          </w:p>
+        </w:tc>
+        <w:tc>
+          <w:tcPr>
+            <w:tcW w:type="dxa" w:w="1700"/>
+            <w:tcMar>
+              <w:top w:w="50" w:type="dxa"/>
+              <w:bottom w:w="50" w:type="dxa"/>
+              <w:left w:w="90" w:type="dxa"/>
+              <w:right w:w="90" w:type="dxa"/>
+            </w:tcMar>
+          </w:tcPr>
+          <w:p>
+            <w:pPr>
+              <w:pStyle w:val="BDOITable"/>
+            </w:pPr>
+            <w:r>
+              <w:rPr>
+                <w:sz w:val="15"/>
+              </w:rPr>
+              <w:t>Program Manager (BPS)</w:t>
+            </w:r>
+          </w:p>
+        </w:tc>
+        <w:tc>
+          <w:tcPr>
+            <w:tcW w:type="dxa" w:w="2153"/>
+            <w:tcMar>
+              <w:top w:w="50" w:type="dxa"/>
+              <w:bottom w:w="50" w:type="dxa"/>
+              <w:left w:w="90" w:type="dxa"/>
+              <w:right w:w="90" w:type="dxa"/>
+            </w:tcMar>
+          </w:tcPr>
+          <w:p>
+            <w:pPr>
+              <w:pStyle w:val="BDOITable"/>
+            </w:pPr>
+            <w:r>
+              <w:rPr>
+                <w:sz w:val="15"/>
+              </w:rPr>
+              <w:t>Product Owner, Operations FT&amp;P</w:t>
+            </w:r>
+          </w:p>
+        </w:tc>
+      </w:tr>
+      <w:tr>
+        <w:tc>
+          <w:tcPr>
+            <w:tcW w:type="dxa" w:w="2946"/>
+            <w:tcMar>
+              <w:top w:w="50" w:type="dxa"/>
+              <w:bottom w:w="50" w:type="dxa"/>
+              <w:left w:w="90" w:type="dxa"/>
+              <w:right w:w="90" w:type="dxa"/>
+            </w:tcMar>
+            <w:shd w:val="clear" w:color="auto" w:fill="E5F5FF"/>
+          </w:tcPr>
+          <w:p>
+            <w:pPr>
+              <w:pStyle w:val="BDOITable"/>
+            </w:pPr>
+            <w:r>
+              <w:rPr>
+                <w:b/>
+                <w:sz w:val="15"/>
+              </w:rPr>
+              <w:t>Business rules and validations</w:t>
+            </w:r>
+          </w:p>
+        </w:tc>
+        <w:tc>
+          <w:tcPr>
+            <w:tcW w:type="dxa" w:w="1360"/>
+            <w:tcMar>
+              <w:top w:w="50" w:type="dxa"/>
+              <w:bottom w:w="50" w:type="dxa"/>
+              <w:left w:w="90" w:type="dxa"/>
+              <w:right w:w="90" w:type="dxa"/>
+            </w:tcMar>
+            <w:shd w:val="clear" w:color="auto" w:fill="E5F5FF"/>
+          </w:tcPr>
+          <w:p>
+            <w:pPr>
+              <w:pStyle w:val="BDOITable"/>
+            </w:pPr>
+            <w:r>
+              <w:rPr>
+                <w:sz w:val="15"/>
+              </w:rPr>
+              <w:t>iorta TechNXT</w:t>
+            </w:r>
+          </w:p>
+        </w:tc>
+        <w:tc>
+          <w:tcPr>
+            <w:tcW w:type="dxa" w:w="1813"/>
+            <w:tcMar>
+              <w:top w:w="50" w:type="dxa"/>
+              <w:bottom w:w="50" w:type="dxa"/>
+              <w:left w:w="90" w:type="dxa"/>
+              <w:right w:w="90" w:type="dxa"/>
+            </w:tcMar>
+            <w:shd w:val="clear" w:color="auto" w:fill="E5F5FF"/>
+          </w:tcPr>
+          <w:p>
+            <w:pPr>
+              <w:pStyle w:val="BDOITable"/>
+            </w:pPr>
+            <w:r>
+              <w:rPr>
+                <w:sz w:val="15"/>
+              </w:rPr>
+              <w:t>FT&amp;P input, BA (BPS)</w:t>
+            </w:r>
+          </w:p>
+        </w:tc>
+        <w:tc>
+          <w:tcPr>
+            <w:tcW w:type="dxa" w:w="1700"/>
+            <w:tcMar>
+              <w:top w:w="50" w:type="dxa"/>
+              <w:bottom w:w="50" w:type="dxa"/>
+              <w:left w:w="90" w:type="dxa"/>
+              <w:right w:w="90" w:type="dxa"/>
+            </w:tcMar>
+            <w:shd w:val="clear" w:color="auto" w:fill="E5F5FF"/>
+          </w:tcPr>
+          <w:p>
+            <w:pPr>
+              <w:pStyle w:val="BDOITable"/>
+            </w:pPr>
+            <w:r>
+              <w:rPr>
+                <w:sz w:val="15"/>
+              </w:rPr>
+              <w:t>Program Manager (BPS)</w:t>
+            </w:r>
+          </w:p>
+        </w:tc>
+        <w:tc>
+          <w:tcPr>
+            <w:tcW w:type="dxa" w:w="2153"/>
+            <w:tcMar>
+              <w:top w:w="50" w:type="dxa"/>
+              <w:bottom w:w="50" w:type="dxa"/>
+              <w:left w:w="90" w:type="dxa"/>
+              <w:right w:w="90" w:type="dxa"/>
+            </w:tcMar>
+            <w:shd w:val="clear" w:color="auto" w:fill="E5F5FF"/>
+          </w:tcPr>
+          <w:p>
+            <w:pPr>
+              <w:pStyle w:val="BDOITable"/>
+            </w:pPr>
+            <w:r>
+              <w:rPr>
+                <w:sz w:val="15"/>
+              </w:rPr>
+              <w:t>Product Owner, Operations FT&amp;P</w:t>
+            </w:r>
+          </w:p>
+        </w:tc>
+      </w:tr>
+      <w:tr>
+        <w:tc>
+          <w:tcPr>
+            <w:tcW w:type="dxa" w:w="2946"/>
+            <w:tcMar>
+              <w:top w:w="50" w:type="dxa"/>
+              <w:bottom w:w="50" w:type="dxa"/>
+              <w:left w:w="90" w:type="dxa"/>
+              <w:right w:w="90" w:type="dxa"/>
+            </w:tcMar>
+          </w:tcPr>
+          <w:p>
+            <w:pPr>
+              <w:pStyle w:val="BDOITable"/>
+            </w:pPr>
+            <w:r>
+              <w:rPr>
+                <w:b/>
+                <w:sz w:val="15"/>
+              </w:rPr>
+              <w:t>Messages and notifications</w:t>
+            </w:r>
+          </w:p>
+        </w:tc>
+        <w:tc>
+          <w:tcPr>
+            <w:tcW w:type="dxa" w:w="1360"/>
+            <w:tcMar>
+              <w:top w:w="50" w:type="dxa"/>
+              <w:bottom w:w="50" w:type="dxa"/>
+              <w:left w:w="90" w:type="dxa"/>
+              <w:right w:w="90" w:type="dxa"/>
+            </w:tcMar>
+          </w:tcPr>
+          <w:p>
+            <w:pPr>
+              <w:pStyle w:val="BDOITable"/>
+            </w:pPr>
+            <w:r>
+              <w:rPr>
+                <w:sz w:val="15"/>
+              </w:rPr>
+              <w:t>iorta TechNXT</w:t>
+            </w:r>
+          </w:p>
+        </w:tc>
+        <w:tc>
+          <w:tcPr>
+            <w:tcW w:type="dxa" w:w="1813"/>
+            <w:tcMar>
+              <w:top w:w="50" w:type="dxa"/>
+              <w:bottom w:w="50" w:type="dxa"/>
+              <w:left w:w="90" w:type="dxa"/>
+              <w:right w:w="90" w:type="dxa"/>
+            </w:tcMar>
+          </w:tcPr>
+          <w:p>
+            <w:pPr>
+              <w:pStyle w:val="BDOITable"/>
+            </w:pPr>
+            <w:r>
+              <w:rPr>
+                <w:sz w:val="15"/>
+              </w:rPr>
+              <w:t>FT&amp;P input</w:t>
+            </w:r>
+          </w:p>
+        </w:tc>
+        <w:tc>
+          <w:tcPr>
+            <w:tcW w:type="dxa" w:w="1700"/>
+            <w:tcMar>
+              <w:top w:w="50" w:type="dxa"/>
+              <w:bottom w:w="50" w:type="dxa"/>
+              <w:left w:w="90" w:type="dxa"/>
+              <w:right w:w="90" w:type="dxa"/>
+            </w:tcMar>
+          </w:tcPr>
+          <w:p>
+            <w:pPr>
+              <w:pStyle w:val="BDOITable"/>
+            </w:pPr>
+            <w:r>
+              <w:rPr>
+                <w:sz w:val="15"/>
+              </w:rPr>
+              <w:t>Program Manager (BPS)</w:t>
+            </w:r>
+          </w:p>
+        </w:tc>
+        <w:tc>
+          <w:tcPr>
+            <w:tcW w:type="dxa" w:w="2153"/>
+            <w:tcMar>
+              <w:top w:w="50" w:type="dxa"/>
+              <w:bottom w:w="50" w:type="dxa"/>
+              <w:left w:w="90" w:type="dxa"/>
+              <w:right w:w="90" w:type="dxa"/>
+            </w:tcMar>
+          </w:tcPr>
+          <w:p>
+            <w:pPr>
+              <w:pStyle w:val="BDOITable"/>
+            </w:pPr>
+            <w:r>
+              <w:rPr>
+                <w:sz w:val="15"/>
+              </w:rPr>
+              <w:t>Product Owner, Operations FT&amp;P</w:t>
+            </w:r>
+          </w:p>
+        </w:tc>
+      </w:tr>
+      <w:tr>
+        <w:tc>
+          <w:tcPr>
+            <w:tcW w:type="dxa" w:w="2946"/>
+            <w:tcMar>
+              <w:top w:w="50" w:type="dxa"/>
+              <w:bottom w:w="50" w:type="dxa"/>
+              <w:left w:w="90" w:type="dxa"/>
+              <w:right w:w="90" w:type="dxa"/>
+            </w:tcMar>
+            <w:shd w:val="clear" w:color="auto" w:fill="E5F5FF"/>
+          </w:tcPr>
+          <w:p>
+            <w:pPr>
+              <w:pStyle w:val="BDOITable"/>
+            </w:pPr>
+            <w:r>
+              <w:rPr>
+                <w:b/>
+                <w:sz w:val="15"/>
+              </w:rPr>
+              <w:t>Documents and reports (receipts, remittance schedules, slips, registers, billings, reports)</w:t>
+            </w:r>
+          </w:p>
+        </w:tc>
+        <w:tc>
+          <w:tcPr>
+            <w:tcW w:type="dxa" w:w="1360"/>
+            <w:tcMar>
+              <w:top w:w="50" w:type="dxa"/>
+              <w:bottom w:w="50" w:type="dxa"/>
+              <w:left w:w="90" w:type="dxa"/>
+              <w:right w:w="90" w:type="dxa"/>
+            </w:tcMar>
+            <w:shd w:val="clear" w:color="auto" w:fill="E5F5FF"/>
+          </w:tcPr>
+          <w:p>
+            <w:pPr>
+              <w:pStyle w:val="BDOITable"/>
+            </w:pPr>
+            <w:r>
+              <w:rPr>
+                <w:sz w:val="15"/>
+              </w:rPr>
+              <w:t>iorta TechNXT</w:t>
+            </w:r>
+          </w:p>
+        </w:tc>
+        <w:tc>
+          <w:tcPr>
+            <w:tcW w:type="dxa" w:w="1813"/>
+            <w:tcMar>
+              <w:top w:w="50" w:type="dxa"/>
+              <w:bottom w:w="50" w:type="dxa"/>
+              <w:left w:w="90" w:type="dxa"/>
+              <w:right w:w="90" w:type="dxa"/>
+            </w:tcMar>
+            <w:shd w:val="clear" w:color="auto" w:fill="E5F5FF"/>
+          </w:tcPr>
+          <w:p>
+            <w:pPr>
+              <w:pStyle w:val="BDOITable"/>
+            </w:pPr>
+            <w:r>
+              <w:rPr>
+                <w:sz w:val="15"/>
+              </w:rPr>
+              <w:t>FT&amp;P input</w:t>
+            </w:r>
+          </w:p>
+        </w:tc>
+        <w:tc>
+          <w:tcPr>
+            <w:tcW w:type="dxa" w:w="1700"/>
+            <w:tcMar>
+              <w:top w:w="50" w:type="dxa"/>
+              <w:bottom w:w="50" w:type="dxa"/>
+              <w:left w:w="90" w:type="dxa"/>
+              <w:right w:w="90" w:type="dxa"/>
+            </w:tcMar>
+            <w:shd w:val="clear" w:color="auto" w:fill="E5F5FF"/>
+          </w:tcPr>
+          <w:p>
+            <w:pPr>
+              <w:pStyle w:val="BDOITable"/>
+            </w:pPr>
+            <w:r>
+              <w:rPr>
+                <w:sz w:val="15"/>
+              </w:rPr>
+              <w:t>Program Manager (BPS)</w:t>
+            </w:r>
+          </w:p>
+        </w:tc>
+        <w:tc>
+          <w:tcPr>
+            <w:tcW w:type="dxa" w:w="2153"/>
+            <w:tcMar>
+              <w:top w:w="50" w:type="dxa"/>
+              <w:bottom w:w="50" w:type="dxa"/>
+              <w:left w:w="90" w:type="dxa"/>
+              <w:right w:w="90" w:type="dxa"/>
+            </w:tcMar>
+            <w:shd w:val="clear" w:color="auto" w:fill="E5F5FF"/>
+          </w:tcPr>
+          <w:p>
+            <w:pPr>
+              <w:pStyle w:val="BDOITable"/>
+            </w:pPr>
+            <w:r>
+              <w:rPr>
+                <w:sz w:val="15"/>
+              </w:rPr>
+              <w:t>Product Owner, Operations FT&amp;P</w:t>
+            </w:r>
+          </w:p>
+        </w:tc>
+      </w:tr>
+      <w:tr>
+        <w:tc>
+          <w:tcPr>
+            <w:tcW w:type="dxa" w:w="2946"/>
+            <w:tcMar>
+              <w:top w:w="50" w:type="dxa"/>
+              <w:bottom w:w="50" w:type="dxa"/>
+              <w:left w:w="90" w:type="dxa"/>
+              <w:right w:w="90" w:type="dxa"/>
+            </w:tcMar>
+          </w:tcPr>
+          <w:p>
+            <w:pPr>
+              <w:pStyle w:val="BDOITable"/>
+            </w:pPr>
+            <w:r>
+              <w:rPr>
+                <w:b/>
+                <w:sz w:val="15"/>
+              </w:rPr>
+              <w:t>Walkthroughs (end-to-end, screen by screen)</w:t>
+            </w:r>
+          </w:p>
+        </w:tc>
+        <w:tc>
+          <w:tcPr>
+            <w:tcW w:type="dxa" w:w="1360"/>
+            <w:tcMar>
+              <w:top w:w="50" w:type="dxa"/>
+              <w:bottom w:w="50" w:type="dxa"/>
+              <w:left w:w="90" w:type="dxa"/>
+              <w:right w:w="90" w:type="dxa"/>
+            </w:tcMar>
+          </w:tcPr>
+          <w:p>
+            <w:pPr>
+              <w:pStyle w:val="BDOITable"/>
+            </w:pPr>
+            <w:r>
+              <w:rPr>
+                <w:sz w:val="15"/>
+              </w:rPr>
+              <w:t>iorta TechNXT</w:t>
+            </w:r>
+          </w:p>
+        </w:tc>
+        <w:tc>
+          <w:tcPr>
+            <w:tcW w:type="dxa" w:w="1813"/>
+            <w:tcMar>
+              <w:top w:w="50" w:type="dxa"/>
+              <w:bottom w:w="50" w:type="dxa"/>
+              <w:left w:w="90" w:type="dxa"/>
+              <w:right w:w="90" w:type="dxa"/>
+            </w:tcMar>
+          </w:tcPr>
+          <w:p>
+            <w:pPr>
+              <w:pStyle w:val="BDOITable"/>
+            </w:pPr>
+            <w:r>
+              <w:rPr>
+                <w:sz w:val="15"/>
+              </w:rPr>
+              <w:t>FT&amp;P input</w:t>
+            </w:r>
+          </w:p>
+        </w:tc>
+        <w:tc>
+          <w:tcPr>
+            <w:tcW w:type="dxa" w:w="1700"/>
+            <w:tcMar>
+              <w:top w:w="50" w:type="dxa"/>
+              <w:bottom w:w="50" w:type="dxa"/>
+              <w:left w:w="90" w:type="dxa"/>
+              <w:right w:w="90" w:type="dxa"/>
+            </w:tcMar>
+          </w:tcPr>
+          <w:p>
+            <w:pPr>
+              <w:pStyle w:val="BDOITable"/>
+            </w:pPr>
+            <w:r>
+              <w:rPr>
+                <w:sz w:val="15"/>
+              </w:rPr>
+              <w:t>Program Manager (BPS)</w:t>
+            </w:r>
+          </w:p>
+        </w:tc>
+        <w:tc>
+          <w:tcPr>
+            <w:tcW w:type="dxa" w:w="2153"/>
+            <w:tcMar>
+              <w:top w:w="50" w:type="dxa"/>
+              <w:bottom w:w="50" w:type="dxa"/>
+              <w:left w:w="90" w:type="dxa"/>
+              <w:right w:w="90" w:type="dxa"/>
+            </w:tcMar>
+          </w:tcPr>
+          <w:p>
+            <w:pPr>
+              <w:pStyle w:val="BDOITable"/>
+            </w:pPr>
+            <w:r>
+              <w:rPr>
+                <w:sz w:val="15"/>
+              </w:rPr>
+              <w:t>Product Owner</w:t>
+            </w:r>
+          </w:p>
+        </w:tc>
+      </w:tr>
+      <w:tr>
+        <w:tc>
+          <w:tcPr>
+            <w:tcW w:type="dxa" w:w="2946"/>
+            <w:tcMar>
+              <w:top w:w="50" w:type="dxa"/>
+              <w:bottom w:w="50" w:type="dxa"/>
+              <w:left w:w="90" w:type="dxa"/>
+              <w:right w:w="90" w:type="dxa"/>
+            </w:tcMar>
+            <w:shd w:val="clear" w:color="auto" w:fill="E5F5FF"/>
+          </w:tcPr>
+          <w:p>
+            <w:pPr>
+              <w:pStyle w:val="BDOITable"/>
+            </w:pPr>
+            <w:r>
+              <w:rPr>
+                <w:b/>
+                <w:sz w:val="15"/>
+              </w:rPr>
+              <w:t>Proposed business rules and clarifications for confirmation</w:t>
+            </w:r>
+          </w:p>
+        </w:tc>
+        <w:tc>
+          <w:tcPr>
+            <w:tcW w:type="dxa" w:w="1360"/>
+            <w:tcMar>
+              <w:top w:w="50" w:type="dxa"/>
+              <w:bottom w:w="50" w:type="dxa"/>
+              <w:left w:w="90" w:type="dxa"/>
+              <w:right w:w="90" w:type="dxa"/>
+            </w:tcMar>
+            <w:shd w:val="clear" w:color="auto" w:fill="E5F5FF"/>
+          </w:tcPr>
+          <w:p>
+            <w:pPr>
+              <w:pStyle w:val="BDOITable"/>
+            </w:pPr>
+            <w:r>
+              <w:rPr>
+                <w:sz w:val="15"/>
+              </w:rPr>
+              <w:t>iorta TechNXT</w:t>
+            </w:r>
+          </w:p>
+        </w:tc>
+        <w:tc>
+          <w:tcPr>
+            <w:tcW w:type="dxa" w:w="1813"/>
+            <w:tcMar>
+              <w:top w:w="50" w:type="dxa"/>
+              <w:bottom w:w="50" w:type="dxa"/>
+              <w:left w:w="90" w:type="dxa"/>
+              <w:right w:w="90" w:type="dxa"/>
+            </w:tcMar>
+            <w:shd w:val="clear" w:color="auto" w:fill="E5F5FF"/>
+          </w:tcPr>
+          <w:p>
+            <w:pPr>
+              <w:pStyle w:val="BDOITable"/>
+            </w:pPr>
+            <w:r>
+              <w:rPr>
+                <w:sz w:val="15"/>
+              </w:rPr>
+              <w:t>BA (BPS), FT&amp;P input</w:t>
+            </w:r>
+          </w:p>
+        </w:tc>
+        <w:tc>
+          <w:tcPr>
+            <w:tcW w:type="dxa" w:w="1700"/>
+            <w:tcMar>
+              <w:top w:w="50" w:type="dxa"/>
+              <w:bottom w:w="50" w:type="dxa"/>
+              <w:left w:w="90" w:type="dxa"/>
+              <w:right w:w="90" w:type="dxa"/>
+            </w:tcMar>
+            <w:shd w:val="clear" w:color="auto" w:fill="E5F5FF"/>
+          </w:tcPr>
+          <w:p>
+            <w:pPr>
+              <w:pStyle w:val="BDOITable"/>
+            </w:pPr>
+            <w:r>
+              <w:rPr>
+                <w:sz w:val="15"/>
+              </w:rPr>
+              <w:t>Program Manager (BPS)</w:t>
+            </w:r>
+          </w:p>
+        </w:tc>
+        <w:tc>
+          <w:tcPr>
+            <w:tcW w:type="dxa" w:w="2153"/>
+            <w:tcMar>
+              <w:top w:w="50" w:type="dxa"/>
+              <w:bottom w:w="50" w:type="dxa"/>
+              <w:left w:w="90" w:type="dxa"/>
+              <w:right w:w="90" w:type="dxa"/>
+            </w:tcMar>
+            <w:shd w:val="clear" w:color="auto" w:fill="E5F5FF"/>
+          </w:tcPr>
+          <w:p>
+            <w:pPr>
+              <w:pStyle w:val="BDOITable"/>
+            </w:pPr>
+            <w:r>
+              <w:rPr>
+                <w:sz w:val="15"/>
+              </w:rPr>
+              <w:t>Product Owner, Operations FT&amp;P</w:t>
+            </w:r>
+          </w:p>
+        </w:tc>
+      </w:tr>
+      <w:tr>
+        <w:tc>
+          <w:tcPr>
+            <w:tcW w:type="dxa" w:w="2946"/>
+            <w:tcMar>
+              <w:top w:w="50" w:type="dxa"/>
+              <w:bottom w:w="50" w:type="dxa"/>
+              <w:left w:w="90" w:type="dxa"/>
+              <w:right w:w="90" w:type="dxa"/>
+            </w:tcMar>
+          </w:tcPr>
+          <w:p>
+            <w:pPr>
+              <w:pStyle w:val="BDOITable"/>
+            </w:pPr>
+            <w:r>
+              <w:rPr>
+                <w:b/>
+                <w:sz w:val="15"/>
+              </w:rPr>
+              <w:t>Interfaces, scheduled runs, user access and menus by persona</w:t>
+            </w:r>
+          </w:p>
+        </w:tc>
+        <w:tc>
+          <w:tcPr>
+            <w:tcW w:type="dxa" w:w="1360"/>
+            <w:tcMar>
+              <w:top w:w="50" w:type="dxa"/>
+              <w:bottom w:w="50" w:type="dxa"/>
+              <w:left w:w="90" w:type="dxa"/>
+              <w:right w:w="90" w:type="dxa"/>
+            </w:tcMar>
+          </w:tcPr>
+          <w:p>
+            <w:pPr>
+              <w:pStyle w:val="BDOITable"/>
+            </w:pPr>
+            <w:r>
+              <w:rPr>
+                <w:sz w:val="15"/>
+              </w:rPr>
+              <w:t>iorta TechNXT</w:t>
+            </w:r>
+          </w:p>
+        </w:tc>
+        <w:tc>
+          <w:tcPr>
+            <w:tcW w:type="dxa" w:w="1813"/>
+            <w:tcMar>
+              <w:top w:w="50" w:type="dxa"/>
+              <w:bottom w:w="50" w:type="dxa"/>
+              <w:left w:w="90" w:type="dxa"/>
+              <w:right w:w="90" w:type="dxa"/>
+            </w:tcMar>
+          </w:tcPr>
+          <w:p>
+            <w:pPr>
+              <w:pStyle w:val="BDOITable"/>
+            </w:pPr>
+            <w:r>
+              <w:rPr>
+                <w:sz w:val="15"/>
+              </w:rPr>
+              <w:t>FT&amp;P input</w:t>
+            </w:r>
+          </w:p>
+        </w:tc>
+        <w:tc>
+          <w:tcPr>
+            <w:tcW w:type="dxa" w:w="1700"/>
+            <w:tcMar>
+              <w:top w:w="50" w:type="dxa"/>
+              <w:bottom w:w="50" w:type="dxa"/>
+              <w:left w:w="90" w:type="dxa"/>
+              <w:right w:w="90" w:type="dxa"/>
+            </w:tcMar>
+          </w:tcPr>
+          <w:p>
+            <w:pPr>
+              <w:pStyle w:val="BDOITable"/>
+            </w:pPr>
+            <w:r>
+              <w:rPr>
+                <w:sz w:val="15"/>
+              </w:rPr>
+              <w:t>BDOI IT</w:t>
+            </w:r>
+          </w:p>
+        </w:tc>
+        <w:tc>
+          <w:tcPr>
+            <w:tcW w:type="dxa" w:w="2153"/>
+            <w:tcMar>
+              <w:top w:w="50" w:type="dxa"/>
+              <w:bottom w:w="50" w:type="dxa"/>
+              <w:left w:w="90" w:type="dxa"/>
+              <w:right w:w="90" w:type="dxa"/>
+            </w:tcMar>
+          </w:tcPr>
+          <w:p>
+            <w:pPr>
+              <w:pStyle w:val="BDOITable"/>
+            </w:pPr>
+            <w:r>
+              <w:rPr>
+                <w:sz w:val="15"/>
+              </w:rPr>
+              <w:t>Product Owner</w:t>
+            </w:r>
+          </w:p>
+        </w:tc>
+      </w:tr>
+      <w:tr>
+        <w:tc>
+          <w:tcPr>
+            <w:tcW w:type="dxa" w:w="2946"/>
+            <w:tcMar>
+              <w:top w:w="50" w:type="dxa"/>
+              <w:bottom w:w="50" w:type="dxa"/>
+              <w:left w:w="90" w:type="dxa"/>
+              <w:right w:w="90" w:type="dxa"/>
+            </w:tcMar>
+            <w:shd w:val="clear" w:color="auto" w:fill="E5F5FF"/>
+          </w:tcPr>
+          <w:p>
+            <w:pPr>
+              <w:pStyle w:val="BDOITable"/>
+            </w:pPr>
+            <w:r>
+              <w:rPr>
+                <w:b/>
+                <w:sz w:val="15"/>
+              </w:rPr>
+              <w:t>Test plan (04 workbook, 05 summary)</w:t>
+            </w:r>
+          </w:p>
+        </w:tc>
+        <w:tc>
+          <w:tcPr>
+            <w:tcW w:type="dxa" w:w="1360"/>
+            <w:tcMar>
+              <w:top w:w="50" w:type="dxa"/>
+              <w:bottom w:w="50" w:type="dxa"/>
+              <w:left w:w="90" w:type="dxa"/>
+              <w:right w:w="90" w:type="dxa"/>
+            </w:tcMar>
+            <w:shd w:val="clear" w:color="auto" w:fill="E5F5FF"/>
+          </w:tcPr>
+          <w:p>
+            <w:pPr>
+              <w:pStyle w:val="BDOITable"/>
+            </w:pPr>
+            <w:r>
+              <w:rPr>
+                <w:sz w:val="15"/>
+              </w:rPr>
+              <w:t>iorta TechNXT</w:t>
+            </w:r>
+          </w:p>
+        </w:tc>
+        <w:tc>
+          <w:tcPr>
+            <w:tcW w:type="dxa" w:w="1813"/>
+            <w:tcMar>
+              <w:top w:w="50" w:type="dxa"/>
+              <w:bottom w:w="50" w:type="dxa"/>
+              <w:left w:w="90" w:type="dxa"/>
+              <w:right w:w="90" w:type="dxa"/>
+            </w:tcMar>
+            <w:shd w:val="clear" w:color="auto" w:fill="E5F5FF"/>
+          </w:tcPr>
+          <w:p>
+            <w:pPr>
+              <w:pStyle w:val="BDOITable"/>
+            </w:pPr>
+            <w:r>
+              <w:rPr>
+                <w:sz w:val="15"/>
+              </w:rPr>
+              <w:t>FT&amp;P input</w:t>
+            </w:r>
+          </w:p>
+        </w:tc>
+        <w:tc>
+          <w:tcPr>
+            <w:tcW w:type="dxa" w:w="1700"/>
+            <w:tcMar>
+              <w:top w:w="50" w:type="dxa"/>
+              <w:bottom w:w="50" w:type="dxa"/>
+              <w:left w:w="90" w:type="dxa"/>
+              <w:right w:w="90" w:type="dxa"/>
+            </w:tcMar>
+            <w:shd w:val="clear" w:color="auto" w:fill="E5F5FF"/>
+          </w:tcPr>
+          <w:p>
+            <w:pPr>
+              <w:pStyle w:val="BDOITable"/>
+            </w:pPr>
+            <w:r>
+              <w:rPr>
+                <w:sz w:val="15"/>
+              </w:rPr>
+              <w:t>Program Manager (BPS), BDOI IT</w:t>
+            </w:r>
+          </w:p>
+        </w:tc>
+        <w:tc>
+          <w:tcPr>
+            <w:tcW w:type="dxa" w:w="2153"/>
+            <w:tcMar>
+              <w:top w:w="50" w:type="dxa"/>
+              <w:bottom w:w="50" w:type="dxa"/>
+              <w:left w:w="90" w:type="dxa"/>
+              <w:right w:w="90" w:type="dxa"/>
+            </w:tcMar>
+            <w:shd w:val="clear" w:color="auto" w:fill="E5F5FF"/>
+          </w:tcPr>
+          <w:p>
+            <w:pPr>
+              <w:pStyle w:val="BDOITable"/>
+            </w:pPr>
+            <w:r>
+              <w:rPr>
+                <w:sz w:val="15"/>
+              </w:rPr>
+              <w:t>Product Owner</w:t>
+            </w:r>
+          </w:p>
+        </w:tc>
+      </w:tr>
+      <w:tr>
+        <w:tc>
+          <w:tcPr>
+            <w:tcW w:type="dxa" w:w="2946"/>
+            <w:tcMar>
+              <w:top w:w="50" w:type="dxa"/>
+              <w:bottom w:w="50" w:type="dxa"/>
+              <w:left w:w="90" w:type="dxa"/>
+              <w:right w:w="90" w:type="dxa"/>
+            </w:tcMar>
+          </w:tcPr>
+          <w:p>
+            <w:pPr>
+              <w:pStyle w:val="BDOITable"/>
+            </w:pPr>
+            <w:r>
+              <w:rPr>
+                <w:b/>
+                <w:sz w:val="15"/>
+              </w:rPr>
+              <w:t>UX screen deck, UX screen register and image package (07 to 09, for the BDOI UX Design team; the screens as specified in this set)</w:t>
+            </w:r>
+          </w:p>
+        </w:tc>
+        <w:tc>
+          <w:tcPr>
+            <w:tcW w:type="dxa" w:w="1360"/>
+            <w:tcMar>
+              <w:top w:w="50" w:type="dxa"/>
+              <w:bottom w:w="50" w:type="dxa"/>
+              <w:left w:w="90" w:type="dxa"/>
+              <w:right w:w="90" w:type="dxa"/>
+            </w:tcMar>
+          </w:tcPr>
+          <w:p>
+            <w:pPr>
+              <w:pStyle w:val="BDOITable"/>
+            </w:pPr>
+            <w:r>
+              <w:rPr>
+                <w:sz w:val="15"/>
+              </w:rPr>
+              <w:t>iorta TechNXT</w:t>
+            </w:r>
+          </w:p>
+        </w:tc>
+        <w:tc>
+          <w:tcPr>
+            <w:tcW w:type="dxa" w:w="1813"/>
+            <w:tcMar>
+              <w:top w:w="50" w:type="dxa"/>
+              <w:bottom w:w="50" w:type="dxa"/>
+              <w:left w:w="90" w:type="dxa"/>
+              <w:right w:w="90" w:type="dxa"/>
+            </w:tcMar>
+          </w:tcPr>
+          <w:p>
+            <w:pPr>
+              <w:pStyle w:val="BDOITable"/>
+            </w:pPr>
+            <w:r>
+              <w:rPr>
+                <w:sz w:val="15"/>
+              </w:rPr>
+              <w:t>FT&amp;P input</w:t>
+            </w:r>
+          </w:p>
+        </w:tc>
+        <w:tc>
+          <w:tcPr>
+            <w:tcW w:type="dxa" w:w="1700"/>
+            <w:tcMar>
+              <w:top w:w="50" w:type="dxa"/>
+              <w:bottom w:w="50" w:type="dxa"/>
+              <w:left w:w="90" w:type="dxa"/>
+              <w:right w:w="90" w:type="dxa"/>
+            </w:tcMar>
+          </w:tcPr>
+          <w:p>
+            <w:pPr>
+              <w:pStyle w:val="BDOITable"/>
+            </w:pPr>
+            <w:r>
+              <w:rPr>
+                <w:sz w:val="15"/>
+              </w:rPr>
+              <w:t>Program Manager (BPS)</w:t>
+            </w:r>
+          </w:p>
+        </w:tc>
+        <w:tc>
+          <w:tcPr>
+            <w:tcW w:type="dxa" w:w="2153"/>
+            <w:tcMar>
+              <w:top w:w="50" w:type="dxa"/>
+              <w:bottom w:w="50" w:type="dxa"/>
+              <w:left w:w="90" w:type="dxa"/>
+              <w:right w:w="90" w:type="dxa"/>
+            </w:tcMar>
+          </w:tcPr>
+          <w:p>
+            <w:pPr>
+              <w:pStyle w:val="BDOITable"/>
+            </w:pPr>
+            <w:r>
+              <w:rPr>
+                <w:sz w:val="15"/>
+              </w:rPr>
+              <w:t>Product Owner</w:t>
+            </w:r>
+          </w:p>
+        </w:tc>
+      </w:tr>
+      <w:tr>
+        <w:tc>
+          <w:tcPr>
+            <w:tcW w:type="dxa" w:w="2946"/>
+            <w:tcMar>
+              <w:top w:w="50" w:type="dxa"/>
+              <w:bottom w:w="50" w:type="dxa"/>
+              <w:left w:w="90" w:type="dxa"/>
+              <w:right w:w="90" w:type="dxa"/>
+            </w:tcMar>
+            <w:shd w:val="clear" w:color="auto" w:fill="E5F5FF"/>
+          </w:tcPr>
+          <w:p>
+            <w:pPr>
+              <w:pStyle w:val="BDOITable"/>
+            </w:pPr>
+            <w:r>
+              <w:rPr>
+                <w:b/>
+                <w:sz w:val="15"/>
+              </w:rPr>
+              <w:t>Technical Specification (separate document, not part of the business sign-off)</w:t>
+            </w:r>
+          </w:p>
+        </w:tc>
+        <w:tc>
+          <w:tcPr>
+            <w:tcW w:type="dxa" w:w="1360"/>
+            <w:tcMar>
+              <w:top w:w="50" w:type="dxa"/>
+              <w:bottom w:w="50" w:type="dxa"/>
+              <w:left w:w="90" w:type="dxa"/>
+              <w:right w:w="90" w:type="dxa"/>
+            </w:tcMar>
+            <w:shd w:val="clear" w:color="auto" w:fill="E5F5FF"/>
+          </w:tcPr>
+          <w:p>
+            <w:pPr>
+              <w:pStyle w:val="BDOITable"/>
+            </w:pPr>
+            <w:r>
+              <w:rPr>
+                <w:sz w:val="15"/>
+              </w:rPr>
+              <w:t>iorta TechNXT</w:t>
+            </w:r>
+          </w:p>
+        </w:tc>
+        <w:tc>
+          <w:tcPr>
+            <w:tcW w:type="dxa" w:w="1813"/>
+            <w:tcMar>
+              <w:top w:w="50" w:type="dxa"/>
+              <w:bottom w:w="50" w:type="dxa"/>
+              <w:left w:w="90" w:type="dxa"/>
+              <w:right w:w="90" w:type="dxa"/>
+            </w:tcMar>
+            <w:shd w:val="clear" w:color="auto" w:fill="E5F5FF"/>
+          </w:tcPr>
+          <w:p>
+            <w:pPr>
+              <w:pStyle w:val="BDOITable"/>
+            </w:pPr>
+            <w:r>
+              <w:rPr>
+                <w:sz w:val="15"/>
+              </w:rPr>
+              <w:t>BDOI IT</w:t>
+            </w:r>
+          </w:p>
+        </w:tc>
+        <w:tc>
+          <w:tcPr>
+            <w:tcW w:type="dxa" w:w="1700"/>
+            <w:tcMar>
+              <w:top w:w="50" w:type="dxa"/>
+              <w:bottom w:w="50" w:type="dxa"/>
+              <w:left w:w="90" w:type="dxa"/>
+              <w:right w:w="90" w:type="dxa"/>
+            </w:tcMar>
+            <w:shd w:val="clear" w:color="auto" w:fill="E5F5FF"/>
+          </w:tcPr>
+          <w:p>
+            <w:pPr>
+              <w:pStyle w:val="BDOITable"/>
+            </w:pPr>
+            <w:r>
+              <w:rPr>
+                <w:sz w:val="15"/>
+              </w:rPr>
+              <w:t>BDOI IT</w:t>
+            </w:r>
+          </w:p>
+        </w:tc>
+        <w:tc>
+          <w:tcPr>
+            <w:tcW w:type="dxa" w:w="2153"/>
+            <w:tcMar>
+              <w:top w:w="50" w:type="dxa"/>
+              <w:bottom w:w="50" w:type="dxa"/>
+              <w:left w:w="90" w:type="dxa"/>
+              <w:right w:w="90" w:type="dxa"/>
+            </w:tcMar>
+            <w:shd w:val="clear" w:color="auto" w:fill="E5F5FF"/>
+          </w:tcPr>
+          <w:p>
+            <w:pPr>
+              <w:pStyle w:val="BDOITable"/>
+            </w:pPr>
+            <w:r>
+              <w:rPr>
+                <w:sz w:val="15"/>
+              </w:rPr>
+              <w:t>BDOI IT</w:t>
+            </w:r>
+          </w:p>
+        </w:tc>
+      </w:tr>
+    </w:tbl>
+    <w:p>
+      <w:pPr>
+        <w:pStyle w:val="BDOISpacer"/>
+      </w:pPr>
+    </w:p>
+    <w:p>
+      <w:pPr>
+        <w:pStyle w:val="Caption"/>
+        <w:keepNext/>
+        <w:spacing w:after="60"/>
+      </w:pPr>
+      <w:r>
+        <w:rPr>
+          <w:b/>
+          <w:i w:val="0"/>
+        </w:rPr>
+        <w:t xml:space="preserve">Table 6: </w:t>
+      </w:r>
+      <w:r>
+        <w:rPr/>
+        <w:t>Signatories and what each confirms (Operations BRD approval sheet p.6-7 (Prepared by, Input Provided by, Reviewed by, Approved by))</w:t>
+      </w:r>
+    </w:p>
+    <w:tbl>
+      <w:tblPr>
+        <w:tblW w:type="dxa" w:w="9973"/>
+        <w:jc w:val="center"/>
+        <w:tblLook w:firstColumn="1" w:firstRow="1" w:lastColumn="0" w:lastRow="0" w:noHBand="0" w:noVBand="1" w:val="04A0"/>
+        <w:tblBorders>
+          <w:top w:val="single" w:sz="4" w:space="0" w:color="C2C2C1"/>
+          <w:left w:val="single" w:sz="4" w:space="0" w:color="C2C2C1"/>
+          <w:bottom w:val="single" w:sz="4" w:space="0" w:color="C2C2C1"/>
+          <w:right w:val="single" w:sz="4" w:space="0" w:color="C2C2C1"/>
+          <w:insideH w:val="single" w:sz="4" w:space="0" w:color="C2C2C1"/>
+          <w:insideV w:val="single" w:sz="4" w:space="0" w:color="C2C2C1"/>
+        </w:tblBorders>
+        <w:tblLayout w:type="fixed"/>
+      </w:tblPr>
+      <w:tblGrid>
+        <w:gridCol w:w="1246"/>
+        <w:gridCol w:w="2833"/>
+        <w:gridCol w:w="3853"/>
+        <w:gridCol w:w="2039"/>
+      </w:tblGrid>
+      <w:tr>
+        <w:trPr>
+          <w:tblHeader w:val="true"/>
+          <w:cantSplit w:val="true"/>
+        </w:trPr>
+        <w:tc>
+          <w:tcPr>
+            <w:tcW w:type="dxa" w:w="1246"/>
+            <w:shd w:val="clear" w:color="auto" w:fill="004EA8"/>
+            <w:tcMar>
+              <w:top w:w="50" w:type="dxa"/>
+              <w:bottom w:w="50" w:type="dxa"/>
+              <w:left w:w="90" w:type="dxa"/>
+              <w:right w:w="90" w:type="dxa"/>
+            </w:tcMar>
+            <w:vAlign w:val="center"/>
+          </w:tcPr>
+          <w:p>
+            <w:pPr>
+              <w:pStyle w:val="BDOITableHeader"/>
+            </w:pPr>
+            <w:r>
+              <w:rPr>
+                <w:b/>
+                <w:color w:val="FFFFFF"/>
+                <w:sz w:val="15"/>
+              </w:rPr>
+              <w:t>Capacity</w:t>
+            </w:r>
+          </w:p>
+        </w:tc>
+        <w:tc>
+          <w:tcPr>
+            <w:tcW w:type="dxa" w:w="2833"/>
+            <w:shd w:val="clear" w:color="auto" w:fill="004EA8"/>
+            <w:tcMar>
+              <w:top w:w="50" w:type="dxa"/>
+              <w:bottom w:w="50" w:type="dxa"/>
+              <w:left w:w="90" w:type="dxa"/>
+              <w:right w:w="90" w:type="dxa"/>
+            </w:tcMar>
+            <w:vAlign w:val="center"/>
+          </w:tcPr>
+          <w:p>
+            <w:pPr>
+              <w:pStyle w:val="BDOITableHeader"/>
+            </w:pPr>
+            <w:r>
+              <w:rPr>
+                <w:b/>
+                <w:color w:val="FFFFFF"/>
+                <w:sz w:val="15"/>
+              </w:rPr>
+              <w:t>Role</w:t>
+            </w:r>
+          </w:p>
+        </w:tc>
+        <w:tc>
+          <w:tcPr>
+            <w:tcW w:type="dxa" w:w="3853"/>
+            <w:shd w:val="clear" w:color="auto" w:fill="004EA8"/>
+            <w:tcMar>
+              <w:top w:w="50" w:type="dxa"/>
+              <w:bottom w:w="50" w:type="dxa"/>
+              <w:left w:w="90" w:type="dxa"/>
+              <w:right w:w="90" w:type="dxa"/>
+            </w:tcMar>
+            <w:vAlign w:val="center"/>
+          </w:tcPr>
+          <w:p>
+            <w:pPr>
+              <w:pStyle w:val="BDOITableHeader"/>
+            </w:pPr>
+            <w:r>
+              <w:rPr>
+                <w:b/>
+                <w:color w:val="FFFFFF"/>
+                <w:sz w:val="15"/>
+              </w:rPr>
+              <w:t>Confirms by signing</w:t>
+            </w:r>
+          </w:p>
+        </w:tc>
+        <w:tc>
+          <w:tcPr>
+            <w:tcW w:type="dxa" w:w="2040"/>
+            <w:shd w:val="clear" w:color="auto" w:fill="004EA8"/>
+            <w:tcMar>
+              <w:top w:w="50" w:type="dxa"/>
+              <w:bottom w:w="50" w:type="dxa"/>
+              <w:left w:w="90" w:type="dxa"/>
+              <w:right w:w="90" w:type="dxa"/>
+            </w:tcMar>
+            <w:vAlign w:val="center"/>
+          </w:tcPr>
+          <w:p>
+            <w:pPr>
+              <w:pStyle w:val="BDOITableHeader"/>
+            </w:pPr>
+            <w:r>
+              <w:rPr>
+                <w:b/>
+                <w:color w:val="FFFFFF"/>
+                <w:sz w:val="15"/>
+              </w:rPr>
+              <w:t>On the BRD approval sheet</w:t>
+            </w:r>
+          </w:p>
+        </w:tc>
+      </w:tr>
+      <w:tr>
+        <w:tc>
+          <w:tcPr>
+            <w:tcW w:type="dxa" w:w="1246"/>
+            <w:tcMar>
+              <w:top w:w="50" w:type="dxa"/>
+              <w:bottom w:w="50" w:type="dxa"/>
+              <w:left w:w="90" w:type="dxa"/>
+              <w:right w:w="90" w:type="dxa"/>
+            </w:tcMar>
+          </w:tcPr>
+          <w:p>
+            <w:pPr>
+              <w:pStyle w:val="BDOITable"/>
+            </w:pPr>
+            <w:r>
+              <w:rPr>
+                <w:sz w:val="15"/>
+              </w:rPr>
+              <w:t>Prepared by</w:t>
+            </w:r>
+          </w:p>
+        </w:tc>
+        <w:tc>
+          <w:tcPr>
+            <w:tcW w:type="dxa" w:w="2833"/>
+            <w:tcMar>
+              <w:top w:w="50" w:type="dxa"/>
+              <w:bottom w:w="50" w:type="dxa"/>
+              <w:left w:w="90" w:type="dxa"/>
+              <w:right w:w="90" w:type="dxa"/>
+            </w:tcMar>
+          </w:tcPr>
+          <w:p>
+            <w:pPr>
+              <w:pStyle w:val="BDOITable"/>
+            </w:pPr>
+            <w:r>
+              <w:rPr>
+                <w:sz w:val="15"/>
+              </w:rPr>
+              <w:t>iorta TechNXT project team: Project Manager, Business Analysis, test lead (iorta TechNXT)</w:t>
+            </w:r>
+          </w:p>
+        </w:tc>
+        <w:tc>
+          <w:tcPr>
+            <w:tcW w:type="dxa" w:w="3853"/>
+            <w:tcMar>
+              <w:top w:w="50" w:type="dxa"/>
+              <w:bottom w:w="50" w:type="dxa"/>
+              <w:left w:w="90" w:type="dxa"/>
+              <w:right w:w="90" w:type="dxa"/>
+            </w:tcMar>
+          </w:tcPr>
+          <w:p>
+            <w:pPr>
+              <w:pStyle w:val="BDOITable"/>
+            </w:pPr>
+            <w:r>
+              <w:rPr>
+                <w:sz w:val="15"/>
+              </w:rPr>
+              <w:t>The set is complete and consistent as issued, traced to the BRD and to the screens; every comment is answered in the comments log</w:t>
+            </w:r>
+          </w:p>
+        </w:tc>
+        <w:tc>
+          <w:tcPr>
+            <w:tcW w:type="dxa" w:w="2040"/>
+            <w:tcMar>
+              <w:top w:w="50" w:type="dxa"/>
+              <w:bottom w:w="50" w:type="dxa"/>
+              <w:left w:w="90" w:type="dxa"/>
+              <w:right w:w="90" w:type="dxa"/>
+            </w:tcMar>
+          </w:tcPr>
+          <w:p>
+            <w:pPr>
+              <w:pStyle w:val="BDOITable"/>
+            </w:pPr>
+            <w:r>
+              <w:rPr>
+                <w:sz w:val="15"/>
+              </w:rPr>
+              <w:t>Added for this set (author of the FRS set)</w:t>
+            </w:r>
+          </w:p>
+        </w:tc>
+      </w:tr>
+      <w:tr>
+        <w:tc>
+          <w:tcPr>
+            <w:tcW w:type="dxa" w:w="1246"/>
+            <w:tcMar>
+              <w:top w:w="50" w:type="dxa"/>
+              <w:bottom w:w="50" w:type="dxa"/>
+              <w:left w:w="90" w:type="dxa"/>
+              <w:right w:w="90" w:type="dxa"/>
+            </w:tcMar>
+            <w:shd w:val="clear" w:color="auto" w:fill="E5F5FF"/>
+          </w:tcPr>
+          <w:p>
+            <w:pPr>
+              <w:pStyle w:val="BDOITable"/>
+            </w:pPr>
+            <w:r>
+              <w:rPr>
+                <w:sz w:val="15"/>
+              </w:rPr>
+              <w:t>Prepared by</w:t>
+            </w:r>
+          </w:p>
+        </w:tc>
+        <w:tc>
+          <w:tcPr>
+            <w:tcW w:type="dxa" w:w="2833"/>
+            <w:tcMar>
+              <w:top w:w="50" w:type="dxa"/>
+              <w:bottom w:w="50" w:type="dxa"/>
+              <w:left w:w="90" w:type="dxa"/>
+              <w:right w:w="90" w:type="dxa"/>
+            </w:tcMar>
+            <w:shd w:val="clear" w:color="auto" w:fill="E5F5FF"/>
+          </w:tcPr>
+          <w:p>
+            <w:pPr>
+              <w:pStyle w:val="BDOITable"/>
+            </w:pPr>
+            <w:r>
+              <w:rPr>
+                <w:sz w:val="15"/>
+              </w:rPr>
+              <w:t>Business Analyst, Enterprise Services Group - Business Project Services (BPS) (Zean C. Ibay) (BDO Unibank ESG)</w:t>
+            </w:r>
+          </w:p>
+        </w:tc>
+        <w:tc>
+          <w:tcPr>
+            <w:tcW w:type="dxa" w:w="3853"/>
+            <w:tcMar>
+              <w:top w:w="50" w:type="dxa"/>
+              <w:bottom w:w="50" w:type="dxa"/>
+              <w:left w:w="90" w:type="dxa"/>
+              <w:right w:w="90" w:type="dxa"/>
+            </w:tcMar>
+            <w:shd w:val="clear" w:color="auto" w:fill="E5F5FF"/>
+          </w:tcPr>
+          <w:p>
+            <w:pPr>
+              <w:pStyle w:val="BDOITable"/>
+            </w:pPr>
+            <w:r>
+              <w:rPr>
+                <w:sz w:val="15"/>
+              </w:rPr>
+              <w:t>The set states the BRD requirements as written; every departure is listed in the proposed rules and clarifications</w:t>
+            </w:r>
+          </w:p>
+        </w:tc>
+        <w:tc>
+          <w:tcPr>
+            <w:tcW w:type="dxa" w:w="2040"/>
+            <w:tcMar>
+              <w:top w:w="50" w:type="dxa"/>
+              <w:bottom w:w="50" w:type="dxa"/>
+              <w:left w:w="90" w:type="dxa"/>
+              <w:right w:w="90" w:type="dxa"/>
+            </w:tcMar>
+            <w:shd w:val="clear" w:color="auto" w:fill="E5F5FF"/>
+          </w:tcPr>
+          <w:p>
+            <w:pPr>
+              <w:pStyle w:val="BDOITable"/>
+            </w:pPr>
+            <w:r>
+              <w:rPr>
+                <w:sz w:val="15"/>
+              </w:rPr>
+              <w:t>Prepared by (p.6)</w:t>
+            </w:r>
+          </w:p>
+        </w:tc>
+      </w:tr>
+      <w:tr>
+        <w:tc>
+          <w:tcPr>
+            <w:tcW w:type="dxa" w:w="1246"/>
+            <w:tcMar>
+              <w:top w:w="50" w:type="dxa"/>
+              <w:bottom w:w="50" w:type="dxa"/>
+              <w:left w:w="90" w:type="dxa"/>
+              <w:right w:w="90" w:type="dxa"/>
+            </w:tcMar>
+          </w:tcPr>
+          <w:p>
+            <w:pPr>
+              <w:pStyle w:val="BDOITable"/>
+            </w:pPr>
+            <w:r>
+              <w:rPr>
+                <w:sz w:val="15"/>
+              </w:rPr>
+              <w:t>Input provided by</w:t>
+            </w:r>
+          </w:p>
+        </w:tc>
+        <w:tc>
+          <w:tcPr>
+            <w:tcW w:type="dxa" w:w="2833"/>
+            <w:tcMar>
+              <w:top w:w="50" w:type="dxa"/>
+              <w:bottom w:w="50" w:type="dxa"/>
+              <w:left w:w="90" w:type="dxa"/>
+              <w:right w:w="90" w:type="dxa"/>
+            </w:tcMar>
+          </w:tcPr>
+          <w:p>
+            <w:pPr>
+              <w:pStyle w:val="BDOITable"/>
+            </w:pPr>
+            <w:r>
+              <w:rPr>
+                <w:sz w:val="15"/>
+              </w:rPr>
+              <w:t>Operations: Financial Transactions and Processing, BU representatives (Shirley Catapang, Perjelyn Joy Gutierrez) (BDOI)</w:t>
+            </w:r>
+          </w:p>
+        </w:tc>
+        <w:tc>
+          <w:tcPr>
+            <w:tcW w:type="dxa" w:w="3853"/>
+            <w:tcMar>
+              <w:top w:w="50" w:type="dxa"/>
+              <w:bottom w:w="50" w:type="dxa"/>
+              <w:left w:w="90" w:type="dxa"/>
+              <w:right w:w="90" w:type="dxa"/>
+            </w:tcMar>
+          </w:tcPr>
+          <w:p>
+            <w:pPr>
+              <w:pStyle w:val="BDOITable"/>
+            </w:pPr>
+            <w:r>
+              <w:rPr>
+                <w:sz w:val="15"/>
+              </w:rPr>
+              <w:t>The Cashiering, Remittance, Adjustment, Production Reconciliation and Commission Receivables screens, fields, rules and messages match the business input</w:t>
+            </w:r>
+          </w:p>
+        </w:tc>
+        <w:tc>
+          <w:tcPr>
+            <w:tcW w:type="dxa" w:w="2040"/>
+            <w:tcMar>
+              <w:top w:w="50" w:type="dxa"/>
+              <w:bottom w:w="50" w:type="dxa"/>
+              <w:left w:w="90" w:type="dxa"/>
+              <w:right w:w="90" w:type="dxa"/>
+            </w:tcMar>
+          </w:tcPr>
+          <w:p>
+            <w:pPr>
+              <w:pStyle w:val="BDOITable"/>
+            </w:pPr>
+            <w:r>
+              <w:rPr>
+                <w:sz w:val="15"/>
+              </w:rPr>
+              <w:t>Input Provided by (p.6)</w:t>
+            </w:r>
+          </w:p>
+        </w:tc>
+      </w:tr>
+      <w:tr>
+        <w:tc>
+          <w:tcPr>
+            <w:tcW w:type="dxa" w:w="1246"/>
+            <w:tcMar>
+              <w:top w:w="50" w:type="dxa"/>
+              <w:bottom w:w="50" w:type="dxa"/>
+              <w:left w:w="90" w:type="dxa"/>
+              <w:right w:w="90" w:type="dxa"/>
+            </w:tcMar>
+            <w:shd w:val="clear" w:color="auto" w:fill="E5F5FF"/>
+          </w:tcPr>
+          <w:p>
+            <w:pPr>
+              <w:pStyle w:val="BDOITable"/>
+            </w:pPr>
+            <w:r>
+              <w:rPr>
+                <w:sz w:val="15"/>
+              </w:rPr>
+              <w:t>Reviewed by</w:t>
+            </w:r>
+          </w:p>
+        </w:tc>
+        <w:tc>
+          <w:tcPr>
+            <w:tcW w:type="dxa" w:w="2833"/>
+            <w:tcMar>
+              <w:top w:w="50" w:type="dxa"/>
+              <w:bottom w:w="50" w:type="dxa"/>
+              <w:left w:w="90" w:type="dxa"/>
+              <w:right w:w="90" w:type="dxa"/>
+            </w:tcMar>
+            <w:shd w:val="clear" w:color="auto" w:fill="E5F5FF"/>
+          </w:tcPr>
+          <w:p>
+            <w:pPr>
+              <w:pStyle w:val="BDOITable"/>
+            </w:pPr>
+            <w:r>
+              <w:rPr>
+                <w:sz w:val="15"/>
+              </w:rPr>
+              <w:t>BDOI Information Technology Group (BDOI IT) (BDOI)</w:t>
+            </w:r>
+          </w:p>
+        </w:tc>
+        <w:tc>
+          <w:tcPr>
+            <w:tcW w:type="dxa" w:w="3853"/>
+            <w:tcMar>
+              <w:top w:w="50" w:type="dxa"/>
+              <w:bottom w:w="50" w:type="dxa"/>
+              <w:left w:w="90" w:type="dxa"/>
+              <w:right w:w="90" w:type="dxa"/>
+            </w:tcMar>
+            <w:shd w:val="clear" w:color="auto" w:fill="E5F5FF"/>
+          </w:tcPr>
+          <w:p>
+            <w:pPr>
+              <w:pStyle w:val="BDOITable"/>
+            </w:pPr>
+            <w:r>
+              <w:rPr>
+                <w:sz w:val="15"/>
+              </w:rPr>
+              <w:t>Interfaces and scheduled runs, user access and menus, the Disbursement queue and the uploads that stand in for other systems, and the Technical Specification (a separate document); not the business screens</w:t>
+            </w:r>
+          </w:p>
+        </w:tc>
+        <w:tc>
+          <w:tcPr>
+            <w:tcW w:type="dxa" w:w="2040"/>
+            <w:tcMar>
+              <w:top w:w="50" w:type="dxa"/>
+              <w:bottom w:w="50" w:type="dxa"/>
+              <w:left w:w="90" w:type="dxa"/>
+              <w:right w:w="90" w:type="dxa"/>
+            </w:tcMar>
+            <w:shd w:val="clear" w:color="auto" w:fill="E5F5FF"/>
+          </w:tcPr>
+          <w:p>
+            <w:pPr>
+              <w:pStyle w:val="BDOITable"/>
+            </w:pPr>
+            <w:r>
+              <w:rPr>
+                <w:sz w:val="15"/>
+              </w:rPr>
+              <w:t>Reviewed by (p.6-7)</w:t>
+            </w:r>
+          </w:p>
+        </w:tc>
+      </w:tr>
+      <w:tr>
+        <w:tc>
+          <w:tcPr>
+            <w:tcW w:type="dxa" w:w="1246"/>
+            <w:tcMar>
+              <w:top w:w="50" w:type="dxa"/>
+              <w:bottom w:w="50" w:type="dxa"/>
+              <w:left w:w="90" w:type="dxa"/>
+              <w:right w:w="90" w:type="dxa"/>
+            </w:tcMar>
+          </w:tcPr>
+          <w:p>
+            <w:pPr>
+              <w:pStyle w:val="BDOITable"/>
+            </w:pPr>
+            <w:r>
+              <w:rPr>
+                <w:sz w:val="15"/>
+              </w:rPr>
+              <w:t>Approved by</w:t>
+            </w:r>
+          </w:p>
+        </w:tc>
+        <w:tc>
+          <w:tcPr>
+            <w:tcW w:type="dxa" w:w="2833"/>
+            <w:tcMar>
+              <w:top w:w="50" w:type="dxa"/>
+              <w:bottom w:w="50" w:type="dxa"/>
+              <w:left w:w="90" w:type="dxa"/>
+              <w:right w:w="90" w:type="dxa"/>
+            </w:tcMar>
+          </w:tcPr>
+          <w:p>
+            <w:pPr>
+              <w:pStyle w:val="BDOITable"/>
+            </w:pPr>
+            <w:r>
+              <w:rPr>
+                <w:sz w:val="15"/>
+              </w:rPr>
+              <w:t>Program Manager, Enterprise Services Group - Business Project Services (BPS) (Dan Ace Cauton) (BDO Unibank ESG)</w:t>
+            </w:r>
+          </w:p>
+        </w:tc>
+        <w:tc>
+          <w:tcPr>
+            <w:tcW w:type="dxa" w:w="3853"/>
+            <w:tcMar>
+              <w:top w:w="50" w:type="dxa"/>
+              <w:bottom w:w="50" w:type="dxa"/>
+              <w:left w:w="90" w:type="dxa"/>
+              <w:right w:w="90" w:type="dxa"/>
+            </w:tcMar>
+          </w:tcPr>
+          <w:p>
+            <w:pPr>
+              <w:pStyle w:val="BDOITable"/>
+            </w:pPr>
+            <w:r>
+              <w:rPr>
+                <w:sz w:val="15"/>
+              </w:rPr>
+              <w:t>Traceability of every BRD requirement to the set and completeness of the set</w:t>
+            </w:r>
+          </w:p>
+        </w:tc>
+        <w:tc>
+          <w:tcPr>
+            <w:tcW w:type="dxa" w:w="2040"/>
+            <w:tcMar>
+              <w:top w:w="50" w:type="dxa"/>
+              <w:bottom w:w="50" w:type="dxa"/>
+              <w:left w:w="90" w:type="dxa"/>
+              <w:right w:w="90" w:type="dxa"/>
+            </w:tcMar>
+          </w:tcPr>
+          <w:p>
+            <w:pPr>
+              <w:pStyle w:val="BDOITable"/>
+            </w:pPr>
+            <w:r>
+              <w:rPr>
+                <w:sz w:val="15"/>
+              </w:rPr>
+              <w:t>Approved by (p.7)</w:t>
+            </w:r>
+          </w:p>
+        </w:tc>
+      </w:tr>
+      <w:tr>
+        <w:tc>
+          <w:tcPr>
+            <w:tcW w:type="dxa" w:w="1246"/>
+            <w:tcMar>
+              <w:top w:w="50" w:type="dxa"/>
+              <w:bottom w:w="50" w:type="dxa"/>
+              <w:left w:w="90" w:type="dxa"/>
+              <w:right w:w="90" w:type="dxa"/>
+            </w:tcMar>
+            <w:shd w:val="clear" w:color="auto" w:fill="E5F5FF"/>
+          </w:tcPr>
+          <w:p>
+            <w:pPr>
+              <w:pStyle w:val="BDOITable"/>
+            </w:pPr>
+            <w:r>
+              <w:rPr>
+                <w:sz w:val="15"/>
+              </w:rPr>
+              <w:t>Approved by</w:t>
+            </w:r>
+          </w:p>
+        </w:tc>
+        <w:tc>
+          <w:tcPr>
+            <w:tcW w:type="dxa" w:w="2833"/>
+            <w:tcMar>
+              <w:top w:w="50" w:type="dxa"/>
+              <w:bottom w:w="50" w:type="dxa"/>
+              <w:left w:w="90" w:type="dxa"/>
+              <w:right w:w="90" w:type="dxa"/>
+            </w:tcMar>
+            <w:shd w:val="clear" w:color="auto" w:fill="E5F5FF"/>
+          </w:tcPr>
+          <w:p>
+            <w:pPr>
+              <w:pStyle w:val="BDOITable"/>
+            </w:pPr>
+            <w:r>
+              <w:rPr>
+                <w:sz w:val="15"/>
+              </w:rPr>
+              <w:t>Operations: Financial Transactions and Processing (Jose Melvin M. Jarin) (BDOI)</w:t>
+            </w:r>
+          </w:p>
+        </w:tc>
+        <w:tc>
+          <w:tcPr>
+            <w:tcW w:type="dxa" w:w="3853"/>
+            <w:tcMar>
+              <w:top w:w="50" w:type="dxa"/>
+              <w:bottom w:w="50" w:type="dxa"/>
+              <w:left w:w="90" w:type="dxa"/>
+              <w:right w:w="90" w:type="dxa"/>
+            </w:tcMar>
+            <w:shd w:val="clear" w:color="auto" w:fill="E5F5FF"/>
+          </w:tcPr>
+          <w:p>
+            <w:pPr>
+              <w:pStyle w:val="BDOITable"/>
+            </w:pPr>
+            <w:r>
+              <w:rPr>
+                <w:sz w:val="15"/>
+              </w:rPr>
+              <w:t>The Operations screens, rules, messages, notifications, documents and accounting events</w:t>
+            </w:r>
+          </w:p>
+        </w:tc>
+        <w:tc>
+          <w:tcPr>
+            <w:tcW w:type="dxa" w:w="2040"/>
+            <w:tcMar>
+              <w:top w:w="50" w:type="dxa"/>
+              <w:bottom w:w="50" w:type="dxa"/>
+              <w:left w:w="90" w:type="dxa"/>
+              <w:right w:w="90" w:type="dxa"/>
+            </w:tcMar>
+            <w:shd w:val="clear" w:color="auto" w:fill="E5F5FF"/>
+          </w:tcPr>
+          <w:p>
+            <w:pPr>
+              <w:pStyle w:val="BDOITable"/>
+            </w:pPr>
+            <w:r>
+              <w:rPr>
+                <w:sz w:val="15"/>
+              </w:rPr>
+              <w:t>Approved by (p.7)</w:t>
+            </w:r>
+          </w:p>
+        </w:tc>
+      </w:tr>
+      <w:tr>
+        <w:tc>
+          <w:tcPr>
+            <w:tcW w:type="dxa" w:w="1246"/>
+            <w:tcMar>
+              <w:top w:w="50" w:type="dxa"/>
+              <w:bottom w:w="50" w:type="dxa"/>
+              <w:left w:w="90" w:type="dxa"/>
+              <w:right w:w="90" w:type="dxa"/>
+            </w:tcMar>
+          </w:tcPr>
+          <w:p>
+            <w:pPr>
+              <w:pStyle w:val="BDOITable"/>
+            </w:pPr>
+            <w:r>
+              <w:rPr>
+                <w:sz w:val="15"/>
+              </w:rPr>
+              <w:t>Approved by</w:t>
+            </w:r>
+          </w:p>
+        </w:tc>
+        <w:tc>
+          <w:tcPr>
+            <w:tcW w:type="dxa" w:w="2833"/>
+            <w:tcMar>
+              <w:top w:w="50" w:type="dxa"/>
+              <w:bottom w:w="50" w:type="dxa"/>
+              <w:left w:w="90" w:type="dxa"/>
+              <w:right w:w="90" w:type="dxa"/>
+            </w:tcMar>
+          </w:tcPr>
+          <w:p>
+            <w:pPr>
+              <w:pStyle w:val="BDOITable"/>
+            </w:pPr>
+            <w:r>
+              <w:rPr>
+                <w:sz w:val="15"/>
+              </w:rPr>
+              <w:t>Product Owner, AVP (Shellah Marie C. Miranda) (BDOI)</w:t>
+            </w:r>
+          </w:p>
+        </w:tc>
+        <w:tc>
+          <w:tcPr>
+            <w:tcW w:type="dxa" w:w="3853"/>
+            <w:tcMar>
+              <w:top w:w="50" w:type="dxa"/>
+              <w:bottom w:w="50" w:type="dxa"/>
+              <w:left w:w="90" w:type="dxa"/>
+              <w:right w:w="90" w:type="dxa"/>
+            </w:tcMar>
+          </w:tcPr>
+          <w:p>
+            <w:pPr>
+              <w:pStyle w:val="BDOITable"/>
+            </w:pPr>
+            <w:r>
+              <w:rPr>
+                <w:sz w:val="15"/>
+              </w:rPr>
+              <w:t>Owns the set and approves all of its contents</w:t>
+            </w:r>
+          </w:p>
+        </w:tc>
+        <w:tc>
+          <w:tcPr>
+            <w:tcW w:type="dxa" w:w="2040"/>
+            <w:tcMar>
+              <w:top w:w="50" w:type="dxa"/>
+              <w:bottom w:w="50" w:type="dxa"/>
+              <w:left w:w="90" w:type="dxa"/>
+              <w:right w:w="90" w:type="dxa"/>
+            </w:tcMar>
+          </w:tcPr>
+          <w:p>
+            <w:pPr>
+              <w:pStyle w:val="BDOITable"/>
+            </w:pPr>
+            <w:r>
+              <w:rPr>
+                <w:sz w:val="15"/>
+              </w:rPr>
+              <w:t>Approved by (p.7)</w:t>
+            </w:r>
+          </w:p>
+        </w:tc>
+      </w:tr>
+    </w:tbl>
+    <w:p>
+      <w:pPr>
+        <w:pStyle w:val="BDOISpacer"/>
+      </w:pPr>
+    </w:p>
+    <w:p>
+      <w:r>
+        <w:rPr/>
+        <w:t>The signatories sign the Sign-off certificate sheet of the sign-off workbook in the same order: prepared by, input provided by, reviewed by, approved by.</w:t>
+      </w:r>
+    </w:p>
+    <w:p>
+      <w:pPr>
+        <w:pStyle w:val="Heading1"/>
+        <w:pBdr>
+          <w:bottom w:val="single" w:sz="4" w:space="4" w:color="99C1E7"/>
+        </w:pBdr>
+      </w:pPr>
+      <w:bookmarkStart w:id="106" w:name="_Toc000106"/>
+      <w:r>
+        <w:rPr/>
+        <w:t>6 Change control after sign-off</w:t>
+      </w:r>
+      <w:bookmarkEnd w:id="106"/>
     </w:p>
     <w:p>
       <w:r>

</xml_diff>

<commit_message>
Deliverable builders take the client logo from the theme pack and the platform logo from its new folder; BRD-02 set rebuilt on the merged texts
</commit_message>
<xml_diff>
--- a/docs/deliverables/out/Drop-1_Transactional/BRD-02_Operations/00_BIBS_StartHere_BRD-02_Operations_v2.0.docx
+++ b/docs/deliverables/out/Drop-1_Transactional/BRD-02_Operations/00_BIBS_StartHere_BRD-02_Operations_v2.0.docx
@@ -18,7 +18,7 @@
               <a:graphicData uri="http://schemas.openxmlformats.org/drawingml/2006/picture">
                 <pic:pic>
                   <pic:nvPicPr>
-                    <pic:cNvPr id="0" name="bdo-insure.png"/>
+                    <pic:cNvPr id="0" name="client-logo.png"/>
                     <pic:cNvPicPr/>
                   </pic:nvPicPr>
                   <pic:blipFill>
@@ -7522,7 +7522,7 @@
             <a:graphicData uri="http://schemas.openxmlformats.org/drawingml/2006/picture">
               <pic:pic>
                 <pic:nvPicPr>
-                  <pic:cNvPr id="0" name="bdo-insure.png"/>
+                  <pic:cNvPr id="0" name="client-logo.png"/>
                   <pic:cNvPicPr/>
                 </pic:nvPicPr>
                 <pic:blipFill>

</xml_diff>